<commit_message>
docs: clarify plug-only delivery and supplier bench testing
</commit_message>
<xml_diff>
--- a/printer/ELECTRICAL_REQUEST_v1_2026-10-13.docx
+++ b/printer/ELECTRICAL_REQUEST_v1_2026-10-13.docx
@@ -37,7 +37,7 @@
           <w:color w:val="000000"/>
           <w:sz w:val="21"/>
         </w:rPr>
-        <w:t>안녕하세요. 전시용 DIY 잉크젯 프린터의 전기부 제작을 문의드립니다. 주요 보드와 모터를 제가 구매해 전달하면, 추가 회로 제작부터 배선·제어함 조립·검사까지 한 업체에서 맡아 주셨으면 합니다. 귀사에서 일부 공정을 협력사에 맡기셔도 괜찮지만, 제게는 한 담당자가 전체 연결과 납품을 책임지는 방식으로 부탁드립니다.</w:t>
+        <w:t>안녕하세요. 어준입니다. 전시용 잉크젯 프린터 1대의 전기부 제작과 조립을 문의드립니다. 주요 부품을 제공하는 조건으로, 추가 회로 제작·제어함 조립·케이블 제작 및 최종 연결·기능검사까지 일괄 의뢰드리고자 합니다.</w:t>
       </w:r>
     </w:p>
     <w:p>
@@ -48,7 +48,7 @@
           <w:color w:val="000000"/>
           <w:sz w:val="21"/>
         </w:rPr>
-        <w:t>납품받은 뒤 제가 할 일은 프레임에 완성품을 볼트로 고정하고, 번호가 표시된 케이블을 연결하는 정도로 생각하고 있습니다. 전선 절단·탈피·압착·납땜·핀 교체·절연 작업은 완료해서 받고 싶습니다. 용접은 요청하지 않습니다.</w:t>
+        <w:t>제어함 내부 배선과 모터·헤드·접점 스위치·전원 배선은 양끝 결선과 나사단자 체결까지 완료하여 부탁드립니다. 기계 조립이나 운송 때문에 분리가 필요한 구간은 번호별 플러그만 연결하면 되는 형태로 요청드립니다. 전선 가공이나 나사단자 결선이 남지 않도록 케이블 제작·절연·전기적 확인까지 포함한 견적을 부탁드립니다.</w:t>
       </w:r>
     </w:p>
     <w:p>
@@ -59,7 +59,7 @@
           <w:color w:val="000000"/>
           <w:sz w:val="21"/>
         </w:rPr>
-        <w:t>프린터는 검정 잉크 카트리지로 297mm 폭 롤지에 글리프를 한 행씩 인쇄합니다. 헤드가 좌우로 움직이고 앞뒤 롤러가 종이를 이동시키며, 종이는 자르지 않고 이어집니다. 기계 프레임과 3D 출력부품 조립은 제가 진행합니다.</w:t>
+        <w:t>프린터는 검정 잉크 카트리지로 297mm 폭 롤지에 글리프를 한 행씩 인쇄하는 장치입니다. 헤드가 좌우로 움직이고 앞뒤 롤러가 종이를 이동시키며, 종이는 자르지 않고 연속으로 출력합니다.</w:t>
       </w:r>
     </w:p>
     <w:p>
@@ -70,7 +70,7 @@
           <w:color w:val="000000"/>
           <w:sz w:val="21"/>
         </w:rPr>
-        <w:t>요청하는 전기부는 Raspberry Pi와 Arduino Uno, 모터 드라이버 3개, 잉크 분사 보드 2개, 전원 어댑터와 스위치를 연결하는 구성입니다. 작은 신호변환 회로와 분사 기본 OFF 회로는 추가 제작이 필요합니다. 이 파일에 부품 목록, 핀별 연결 기준, 케이블과 검사 범위를 함께 담았습니다.</w:t>
+        <w:t>Raspberry Pi와 Arduino Uno, 모터 드라이버 3개, 잉크 분사 보드 2개를 연결하는 구성입니다. 신호변환 회로와 분사 입력의 기본 OFF 회로는 추가 제작이 필요합니다. 검토에 참고하실 수 있도록 예상 배치도, 부품 목록, 핀별 연결 기준과 검사 항목을 첨부하였습니다.</w:t>
       </w:r>
     </w:p>
     <w:p>
@@ -81,7 +81,7 @@
           <w:color w:val="000000"/>
           <w:sz w:val="21"/>
         </w:rPr>
-        <w:t>현재 자료로 검토와 견적이 가능한지, 제작에 필요한 회로도 보완까지 맡을 수 있는지 알려 주세요. 부품을 모두 받은 뒤 작업 기간과 반송 기간을 포함해 2026년 10월 말, 늦어도 11월 7일까지 국내 수령 가능한 일정인지 부탁드립니다.</w:t>
+        <w:t>첨부 자료를 기준으로 제작 가능 여부와 예상 비용을 안내해 주시면 감사하겠습니다. 제작용 회로도 보완과 실제 부품의 접점 확인도 함께 요청드립니다. 희망 수령일은 2026년 10월 말이며, 늦어도 11월 7일까지 수령 가능한 일정인지 검토 부탁드립니다.</w:t>
       </w:r>
     </w:p>
     <w:p>
@@ -92,7 +92,7 @@
           <w:color w:val="000000"/>
           <w:sz w:val="21"/>
         </w:rPr>
-        <w:t>이 자료는 제작 검토 기준입니다. 실제 부품의 접점 확인과 제작용 도면 승인을 거쳐 발주하려고 합니다. 이번 문의에 전시 웹사이트나 전체 프린터 응용 프로그램 개발은 포함하지 않습니다. 전기부 기능검사에 필요한 시험 신호나 간단한 시험 코드 준비는 견적에 구분해 주세요.</w:t>
+        <w:t>견적은 전기부 제작·최종 결선과 벤치 기능검사를 기준으로 부탁드립니다. 검사용 신호와 코드 준비부터 실행·계측·전기적 고장 진단·보완 후 재검사까지 맡아 주실 수 있는지 검토 부탁드립니다. 별도의 전기 검사나 고장 진단을 진행하지 않아도 되는 납품 범위인지, 가능한 검사 항목과 비용을 함께 안내해 주시면 감사하겠습니다.</w:t>
       </w:r>
     </w:p>
     <w:p>
@@ -127,7 +127,7 @@
         <w:drawing>
           <wp:inline xmlns:a="http://schemas.openxmlformats.org/drawingml/2006/main" xmlns:pic="http://schemas.openxmlformats.org/drawingml/2006/picture">
             <wp:extent cx="6264000" cy="2262000"/>
-            <wp:docPr id="1" name="Picture 1" descr="메인 PC에서 Pi, 모터 신호 회로와 드라이버, Uno와 잉크 분사 보드로 이어지는 전기 구성"/>
+            <wp:docPr id="1" name="Picture 1" descr="프린터 전기부 전체 연결 구성"/>
             <wp:cNvGraphicFramePr>
               <a:graphicFrameLocks noChangeAspect="1"/>
             </wp:cNvGraphicFramePr>
@@ -135,7 +135,7 @@
               <a:graphicData uri="http://schemas.openxmlformats.org/drawingml/2006/picture">
                 <pic:pic>
                   <pic:nvPicPr>
-                    <pic:cNvPr id="0" name="overview.png"/>
+                    <pic:cNvPr id="0" name="electrical_overview_2026-10-13.png"/>
                     <pic:cNvPicPr/>
                   </pic:nvPicPr>
                   <pic:blipFill>
@@ -166,7 +166,7 @@
           <w:color w:val="000000"/>
           <w:sz w:val="21"/>
         </w:rPr>
-        <w:t>메인 PC에서 완성된 흑백 이미지를 보내고, 프린터용 Pi가 이미지 대기열과 모터 이동을 담당합니다. Pi와 USB로 연결된 Uno가 12개 잉크 분사 신호를 담당합니다. 프로그램의 역할을 설명한 것이며 현재 완성된 구동 소프트웨어가 있다는 뜻은 아닙니다.</w:t>
+        <w:t>메인 PC에서 완성된 흑백 이미지를 전송하면 Pi에서 이미지 대기열과 모터 이동을 처리하고, USB로 연결된 Uno에서 12개 잉크 분사 신호를 출력하는 구성입니다.</w:t>
       </w:r>
     </w:p>
     <w:tbl>
@@ -217,7 +217,7 @@
                 <w:color w:val="000000"/>
                 <w:sz w:val="18"/>
               </w:rPr>
-              <w:t>구분</w:t>
+              <w:t>의뢰 범위</w:t>
             </w:r>
           </w:p>
         </w:tc>
@@ -239,7 +239,7 @@
                 <w:color w:val="000000"/>
                 <w:sz w:val="18"/>
               </w:rPr>
-              <w:t>담당 작업</w:t>
+              <w:t>요청 내용</w:t>
             </w:r>
           </w:p>
         </w:tc>
@@ -265,7 +265,7 @@
                 <w:color w:val="000000"/>
                 <w:sz w:val="18"/>
               </w:rPr>
-              <w:t>제가 준비</w:t>
+              <w:t>회로와 제어함</w:t>
             </w:r>
           </w:p>
         </w:tc>
@@ -286,7 +286,7 @@
                 <w:color w:val="000000"/>
                 <w:sz w:val="18"/>
               </w:rPr>
-              <w:t>주요 보드·모터·카트리지·홀더·어댑터의 구매와 전달, 기계 프레임 및 급지부 조립</w:t>
+              <w:t>추가 회로 제작, 소형 전자부품 조달, 보드 고정, 전원 분배와 내부 결선</w:t>
             </w:r>
           </w:p>
         </w:tc>
@@ -312,7 +312,7 @@
                 <w:color w:val="000000"/>
                 <w:sz w:val="18"/>
               </w:rPr>
-              <w:t>업체 전체 담당</w:t>
+              <w:t>외부 배선과 최종 연결</w:t>
             </w:r>
           </w:p>
         </w:tc>
@@ -333,7 +333,7 @@
                 <w:color w:val="000000"/>
                 <w:sz w:val="18"/>
               </w:rPr>
-              <w:t>추가 회로 제작, 소형 전자부품 조달, 내부 결선, 외부 케이블 제작, 제어함 가공·고정, 검사와 연결 안내</w:t>
+              <w:t>케이블 양끝 결선·나사단자 체결·절연 완료, 분리 구간 번호별 플러그, 배선 식별과 고정</w:t>
             </w:r>
           </w:p>
         </w:tc>
@@ -359,7 +359,7 @@
                 <w:color w:val="000000"/>
                 <w:sz w:val="18"/>
               </w:rPr>
-              <w:t>제가 수령 후 진행</w:t>
+              <w:t>벤치 전기 검사</w:t>
             </w:r>
           </w:p>
         </w:tc>
@@ -380,7 +380,54 @@
                 <w:color w:val="000000"/>
                 <w:sz w:val="18"/>
               </w:rPr>
-              <w:t>완성 제어함과 헤드 연결부 고정, 표시대로 케이블 연결, 기계 높이·장력 조정과 전체 인쇄 시험</w:t>
+              <w:t>시험 신호·코드 준비, 실행·계측·전기적 고장 진단과 보완 후 재검사</w:t>
+            </w:r>
+          </w:p>
+        </w:tc>
+      </w:tr>
+      <w:tr>
+        <w:trPr>
+          <w:cantSplit/>
+        </w:trPr>
+        <w:tc>
+          <w:tcPr>
+            <w:tcW w:type="dxa" w:w="2381"/>
+            <w:vAlign w:val="center"/>
+          </w:tcPr>
+          <w:p>
+            <w:pPr>
+              <w:keepNext w:val="0"/>
+              <w:spacing w:after="0" w:line="252" w:lineRule="auto"/>
+            </w:pPr>
+            <w:r>
+              <w:rPr>
+                <w:rFonts w:ascii="Arial" w:hAnsi="Arial" w:eastAsia="Apple SD Gothic Neo"/>
+                <w:b w:val="0"/>
+                <w:color w:val="000000"/>
+                <w:sz w:val="18"/>
+              </w:rPr>
+              <w:t>납품 자료</w:t>
+            </w:r>
+          </w:p>
+        </w:tc>
+        <w:tc>
+          <w:tcPr>
+            <w:tcW w:type="dxa" w:w="7483"/>
+            <w:vAlign w:val="center"/>
+          </w:tcPr>
+          <w:p>
+            <w:pPr>
+              <w:keepNext w:val="0"/>
+              <w:spacing w:after="0" w:line="252" w:lineRule="auto"/>
+            </w:pPr>
+            <w:r>
+              <w:rPr>
+                <w:rFonts w:ascii="Arial" w:hAnsi="Arial" w:eastAsia="Apple SD Gothic Neo"/>
+                <w:b w:val="0"/>
+                <w:color w:val="000000"/>
+                <w:sz w:val="18"/>
+              </w:rPr>
+              <w:t>최종 연결표, 설정값, 검사 결과, 플러그 연결과 전원 사용 안내</w:t>
             </w:r>
           </w:p>
         </w:tc>
@@ -407,7 +454,7 @@
           <w:color w:val="000000"/>
           <w:sz w:val="21"/>
         </w:rPr>
-        <w:t>전원은 밀폐형 외장 어댑터를 사용합니다. 사용자가 220V 단자를 결선하는 구조를 원하지 않습니다. AC 코드는 기성 완성품을 그대로 사용하고, 제작 배선은 어댑터 이후의 저전압 구간입니다. 프레임 용접이나 금속 구조물 제작은 이 전기부 문의에서 제외합니다.</w:t>
+        <w:t>전원은 밀폐형 외장 어댑터와 기성 AC 코드를 사용합니다. 제작 배선은 어댑터 이후의 DC 전원과 제어 신호 구간을 기준으로 부탁드립니다.</w:t>
       </w:r>
     </w:p>
     <w:p>
@@ -420,7 +467,92 @@
         <w:pStyle w:val="Heading1"/>
       </w:pPr>
       <w:r>
-        <w:t>3 주요 부품과 업체 제작품</w:t>
+        <w:t>3 장치 예상 배치도</w:t>
+      </w:r>
+    </w:p>
+    <w:p>
+      <w:pPr>
+        <w:jc w:val="center"/>
+      </w:pPr>
+      <w:r>
+        <w:drawing>
+          <wp:inline xmlns:a="http://schemas.openxmlformats.org/drawingml/2006/main" xmlns:pic="http://schemas.openxmlformats.org/drawingml/2006/picture">
+            <wp:extent cx="6264000" cy="3897600"/>
+            <wp:docPr id="2" name="Picture 2" descr="프린터와 제어함 예상 배치"/>
+            <wp:cNvGraphicFramePr>
+              <a:graphicFrameLocks noChangeAspect="1"/>
+            </wp:cNvGraphicFramePr>
+            <a:graphic>
+              <a:graphicData uri="http://schemas.openxmlformats.org/drawingml/2006/picture">
+                <pic:pic>
+                  <pic:nvPicPr>
+                    <pic:cNvPr id="0" name="electrical_expected_layout_2026-10-13.png"/>
+                    <pic:cNvPicPr/>
+                  </pic:nvPicPr>
+                  <pic:blipFill>
+                    <a:blip r:embed="rId12"/>
+                    <a:stretch>
+                      <a:fillRect/>
+                    </a:stretch>
+                  </pic:blipFill>
+                  <pic:spPr>
+                    <a:xfrm>
+                      <a:off x="0" y="0"/>
+                      <a:ext cx="6264000" cy="3897600"/>
+                    </a:xfrm>
+                    <a:prstGeom prst="rect"/>
+                  </pic:spPr>
+                </pic:pic>
+              </a:graphicData>
+            </a:graphic>
+          </wp:inline>
+        </w:drawing>
+      </w:r>
+    </w:p>
+    <w:p>
+      <w:r>
+        <w:rPr>
+          <w:rFonts w:ascii="Arial" w:hAnsi="Arial" w:eastAsia="Apple SD Gothic Neo"/>
+          <w:b w:val="0"/>
+          <w:color w:val="000000"/>
+          <w:sz w:val="21"/>
+        </w:rPr>
+        <w:t>프레임 외곽은 600×440mm, 인쇄 받침판은 300×180mm, 공급 롤 받침판은 600×200mm를 기준으로 합니다. X축 레일 길이는 500mm이며 유효 이동거리는 약 345mm입니다. 용지 폭은 297mm, 목표 인쇄 폭은 약 270mm입니다.</w:t>
+      </w:r>
+    </w:p>
+    <w:p>
+      <w:r>
+        <w:rPr>
+          <w:rFonts w:ascii="Arial" w:hAnsi="Arial" w:eastAsia="Apple SD Gothic Neo"/>
+          <w:b w:val="0"/>
+          <w:color w:val="000000"/>
+          <w:sz w:val="21"/>
+        </w:rPr>
+        <w:t>이 배치도는 장치 배치와 배선 길이 검토용입니다. 제어함 위치, 케이블 길이와 가동 여유를 검토하시어 연결 사양 확정을 부탁드립니다. 외부 케이블도 양끝 결선과 나사단자 체결을 완료하고, 기계 조립을 위해 분리되는 구간은 번호별 플러그로 구성해 주시기 바랍니다.</w:t>
+      </w:r>
+    </w:p>
+    <w:p>
+      <w:r>
+        <w:rPr>
+          <w:rFonts w:ascii="Arial" w:hAnsi="Arial" w:eastAsia="Apple SD Gothic Neo"/>
+          <w:b w:val="0"/>
+          <w:color w:val="000000"/>
+          <w:sz w:val="21"/>
+        </w:rPr>
+        <w:t>이번 검사 범위는 프레임 장착 전 모터·스위치·분사부의 벤치 전기 시험입니다. 실제 캐리지 이동, 원점·끝단 위치 조정, 급지와 인쇄 상태 확인은 기계 조립 후 별도 시험으로 구분하여 부탁드립니다.</w:t>
+      </w:r>
+    </w:p>
+    <w:p>
+      <w:r>
+        <w:br w:type="page"/>
+      </w:r>
+    </w:p>
+    <w:p>
+      <w:pPr>
+        <w:pStyle w:val="Heading1"/>
+      </w:pPr>
+      <w:r>
+        <w:t>4 주요 부품과 추가 제작품</w:t>
       </w:r>
     </w:p>
     <w:tbl>
@@ -1579,7 +1711,7 @@
           <w:color w:val="000000"/>
           <w:sz w:val="21"/>
         </w:rPr>
-        <w:t>위 목록은 현재 선정 기준입니다. 실제 구매·입고 여부는 전달 때 확인합니다. 기존 보유 Pi는 디스플레이용이므로 프린터용 Pi는 별도 준비합니다. Q2299A와 FFC는 실제 접점 대조를 위해 현물로 전달하고, 예비 카트리지는 밀봉 보관합니다.</w:t>
+        <w:t>추가 제작품은 3.3V에서 5V로 모터 신호를 전달하는 회로 1식, 분사 입력 12개의 기본 OFF 저항 회로 1식, 탈착식 시험 저항 부하 1식입니다. DC 전원 분배·퓨즈·스위치 연결과 모든 내부·외부 배선, 제어함 조립도 포함하여 부탁드립니다. 저항·IC·소켓·단자·전선 등 소부품은 조달 비용을 견적에 포함해 주시기 바랍니다.</w:t>
       </w:r>
     </w:p>
     <w:p>
@@ -1590,18 +1722,7 @@
           <w:color w:val="000000"/>
           <w:sz w:val="21"/>
         </w:rPr>
-        <w:t>업체 제작품은 3.3V에서 5V로 모터 신호를 전달하는 회로 1식, 분사 입력 12개의 기본 OFF 저항 회로 1식, 탈착식 시험 저항 부하 1식, DC 전원 분배·퓨즈·스위치 연결, 모든 내부·외부 배선과 제어함 조립입니다. 저항·IC·소켓·단자·전선 등 소부품은 업체에서 조달해 주세요.</w:t>
-      </w:r>
-    </w:p>
-    <w:p>
-      <w:r>
-        <w:rPr>
-          <w:rFonts w:ascii="Arial" w:hAnsi="Arial" w:eastAsia="Apple SD Gothic Neo"/>
-          <w:b w:val="0"/>
-          <w:color w:val="000000"/>
-          <w:sz w:val="21"/>
-        </w:rPr>
-        <w:t>기성 모듈과 모터의 동봉선을 가능한 범위에서 활용해 주세요. 추가 회로는 만능기판 또는 소형 PCB 중 단품 제작에 적합한 방법을 제안해 주세요. 현재 제조용 PCB 파일은 없습니다. 모델 변경이 필요하면 이유와 연결 변경을 먼저 알려 주세요.</w:t>
+        <w:t>기성 모듈과 모터의 동봉선을 활용할 수 있는 경우 활용을 부탁드립니다. 추가 회로는 만능기판 또는 소형 PCB 중 단품 제작에 적합한 방법으로 제안해 주시면 감사하겠습니다. 제작용 회로도와 PCB 설계가 필요한 경우 해당 비용을 구분해 주시기 바랍니다. 부품 변경이 필요한 경우 변경 사유와 적용 구성을 안내 부탁드립니다.</w:t>
       </w:r>
     </w:p>
     <w:p>
@@ -1614,7 +1735,7 @@
         <w:pStyle w:val="Heading1"/>
       </w:pPr>
       <w:r>
-        <w:t>4 Pi와 모터 신호 회로</w:t>
+        <w:t>5 Pi와 모터 신호 회로</w:t>
       </w:r>
     </w:p>
     <w:p>
@@ -2638,7 +2759,7 @@
           <w:color w:val="000000"/>
           <w:sz w:val="21"/>
         </w:rPr>
-        <w:t>각 Pi 신호와 U3 입력 사이에 330Ω을 직렬로 넣고, 그 뒤 U3 입력에서 GND로 10kΩ 풀다운을 둡니다. 각 U3 출력은 10kΩ으로 +5_I4에 풀업합니다. 출력끼리 묶지 않습니다. 업체에서 실제 드라이버 입력 전류와 U3의 채널별·패키지 합계 전류를 대조하고, 구동 여유가 부족하면 변경안을 알려 주세요.</w:t>
+        <w:t>각 Pi 신호와 U3 입력 사이에 330Ω을 직렬로 넣고, 그 뒤 U3 입력에서 GND로 10kΩ 풀다운을 둡니다. 각 U3 출력은 10kΩ으로 +5_I4에 풀업하며 출력끼리 묶지 않습니다. 실제 드라이버 입력 전류와 U3의 채널별·패키지 합계 전류를 대조하여 구동 여유가 부족한 경우 변경안 검토를 부탁드립니다.</w:t>
       </w:r>
     </w:p>
     <w:tbl>
@@ -3114,7 +3235,7 @@
           <w:color w:val="000000"/>
           <w:sz w:val="21"/>
         </w:rPr>
-        <w:t>정상 5V에서 ARM LOW는 전달 차단, ARM HIGH는 전달 허용입니다. STEP 대기는 HIGH로 두고, STEP와 DIR을 안정시킨 뒤 ARM을 허용해야 합니다. 전원 상승·하강 때의 불필요한 펄스는 실제 부하를 연결해 검사해 주세요. OE의 5V 지점을 Pi GPIO에 직접 연결하지 않습니다.</w:t>
+        <w:t>정상 5V에서 ARM LOW는 전달 차단, ARM HIGH는 전달 허용입니다. STEP 대기는 HIGH로 두고, STEP와 DIR을 안정시킨 뒤 ARM을 허용해야 합니다. 전원 상승·하강 때 불필요한 펄스가 발생하지 않는지 실제 부하 검사도 부탁드립니다. OE의 5V 지점은 Pi GPIO와 직접 연결하지 않습니다.</w:t>
       </w:r>
     </w:p>
     <w:p>
@@ -3125,7 +3246,7 @@
           <w:color w:val="000000"/>
           <w:sz w:val="21"/>
         </w:rPr>
-        <w:t>각 드라이버는 OPTO에 +5_I4, PUL과 DIR에 해당 출력만 연결하고 ENA는 현재 기준에서 비워 둡니다. ARM 차단은 펄스 전달 차단이며 모터 전원 차단은 아닙니다. Pi GND에서 모터 전원 GND로 추가 점퍼를 넣지 않고, 실제 전원·USB의 공통 경로는 측정해 기록해 주세요.</w:t>
+        <w:t>각 드라이버는 OPTO에 +5_I4, PUL과 DIR에 해당 출력만 연결하고 ENA는 비워 둡니다. ARM 차단은 펄스 전달 차단이며 모터 전원 차단은 아닙니다. Pi GND에서 모터 전원 GND로 추가 점퍼를 넣지 않는 구성으로, 실제 전원·USB의 공통 경로 측정과 기록을 부탁드립니다.</w:t>
       </w:r>
     </w:p>
     <w:p>
@@ -3138,7 +3259,7 @@
         <w:pStyle w:val="Heading1"/>
       </w:pPr>
       <w:r>
-        <w:t>5 전원 분배와 접점 입력</w:t>
+        <w:t>6 전원 분배와 접점 입력</w:t>
       </w:r>
     </w:p>
     <w:p>
@@ -3578,7 +3699,7 @@
           <w:color w:val="000000"/>
           <w:sz w:val="21"/>
         </w:rPr>
-        <w:t>DC 잭 기준은 24V용 중심 양극 5.5×2.5mm, 18V용 중심 양극 5.5×2.1mm입니다. 스위치는 DC30V 20A S1A 기준이며 배선·절연을 완료해 주세요. 퓨즈는 실제 부하·선 굵기와 맞는지 확인합니다. 하나의 WAGO 안에는 같은 전기 지점만 넣습니다.</w:t>
+        <w:t>DC 잭 기준은 24V용 중심 양극 5.5×2.5mm, 18V용 중심 양극 5.5×2.1mm입니다. 스위치는 DC30V 20A S1A 기준이며 배선·절연까지 완료하여 부탁드립니다. 퓨즈는 실제 부하·선 굵기에 적합한지 확인하고, 하나의 WAGO 안에는 같은 전기 지점만 연결합니다.</w:t>
       </w:r>
     </w:p>
     <w:p>
@@ -3589,7 +3710,7 @@
           <w:color w:val="000000"/>
           <w:sz w:val="21"/>
         </w:rPr>
-        <w:t>급지 모터는 1.68A 상전류입니다. 최초 무부하 설정은 DM332T 1.63A peak 1.16A RMS, SW1 ON SW2 OFF SW3 ON을 기준으로 검토합니다. X축 모터 설정은 현물 라벨과 코일 측정으로 정합니다. 최종 DIP 설정과 마이크로스텝 값을 납품 기록에 남겨 주세요.</w:t>
+        <w:t>급지 모터는 1.68A 상전류입니다. 최초 무부하 설정은 DM332T 1.63A peak 1.16A RMS, SW1 ON SW2 OFF SW3 ON을 기준으로 검토 부탁드립니다. X축 모터 설정은 현물 라벨과 코일 측정을 기준으로 하며, 최종 DIP 설정과 마이크로스텝 값을 납품 자료에 포함해 주시기 바랍니다.</w:t>
       </w:r>
     </w:p>
     <w:tbl>
@@ -4021,7 +4142,7 @@
           <w:color w:val="000000"/>
           <w:sz w:val="21"/>
         </w:rPr>
-        <w:t>접점 입력은 프로그램에서 처리해야 정지합니다. 이번 견적에서는 입력 측정과 시험 코드로 동작 확인까지 요청합니다. 정지 입력을 해제해도 자동 재개되지 않게 검사하고, 전원 차단을 대신하는 안전 인증 비상정지 장치로 표시하지 않습니다.</w:t>
+        <w:t>접점 입력은 프로그램에서 처리해야 정지하므로 입력 측정과 시험 코드에 의한 동작 확인까지 부탁드립니다. 벤치에서 각 스위치를 눌렀을 때와 해제·단선 상태의 입력을 확인하고, 정지 요청 해제만으로 모터 펄스가 자동 재개되지 않는 조건으로 검사를 요청드립니다. 해당 접점 입력은 전원 차단용 비상정지 장치와 구분합니다.</w:t>
       </w:r>
     </w:p>
     <w:p>
@@ -4034,7 +4155,7 @@
         <w:pStyle w:val="Heading1"/>
       </w:pPr>
       <w:r>
-        <w:t>6 Uno와 잉크 분사 보드</w:t>
+        <w:t>7 Uno와 잉크 분사 보드</w:t>
       </w:r>
     </w:p>
     <w:p>
@@ -5968,7 +6089,7 @@
           <w:color w:val="000000"/>
           <w:sz w:val="21"/>
         </w:rPr>
-        <w:t>수령 보드의 ULN2803 계열 IC, E1 콘덴서 25V 이상 여부와 실제 단자를 공개 회로와 대조해 주세요. 다른 회로가 납품되면 부품 하나를 임의 교체해 진행하지 않고 알려 주세요. 단자 이름과 도통으로 대응하며 사진의 좌우를 핀 번호로 가정하지 않습니다.</w:t>
+        <w:t>수령 보드의 ULN2803 계열 IC, E1 콘덴서 25V 이상 여부와 실제 단자를 제조사 회로와 대조 부탁드립니다. 사양 차이가 있는 경우 적용 가능 여부와 변경안을 안내해 주시기 바랍니다. 단자 이름과 도통 측정을 기준으로 대응을 확인합니다.</w:t>
       </w:r>
     </w:p>
     <w:p>
@@ -5981,7 +6102,7 @@
         <w:pStyle w:val="Heading1"/>
       </w:pPr>
       <w:r>
-        <w:t>7 헤드 리본 접점 대조</w:t>
+        <w:t>8 헤드 리본 접점 대조</w:t>
       </w:r>
     </w:p>
     <w:p>
@@ -5992,7 +6113,7 @@
           <w:color w:val="000000"/>
           <w:sz w:val="21"/>
         </w:rPr>
-        <w:t>아래 RC는 원작 Figure 9 그림에서 리본 끝이 왼쪽, 케이블이 오른쪽으로 뻗을 때 위에서 아래로 붙인 위치 이름입니다. HP 공식 핀 번호 또는 실제 변환보드 번호가 아닙니다. 표의 마지막 칸은 업체가 현물 검사 후 작성할 항목입니다.</w:t>
+        <w:t>아래 RC는 참고 회로 Figure 9에서 리본 끝이 왼쪽, 케이블이 오른쪽으로 뻗을 때 위에서 아래로 붙인 위치 이름입니다. HP 공식 핀 번호나 실제 변환보드 번호와는 구분하며, 마지막 칸은 현물 대조 후 기입을 부탁드립니다.</w:t>
       </w:r>
     </w:p>
     <w:tbl>
@@ -7220,7 +7341,7 @@
           <w:color w:val="000000"/>
           <w:sz w:val="21"/>
         </w:rPr>
-        <w:t>빈 홀더에서 Q2299A 접점 → 리본 → 변환보드 패드까지 16개 모두 도통을 확인하고 방향 사진을 남겨 주세요. 의도된 공통 연결과 인접 단락을 구분합니다. 카트리지를 끼운 상태의 저항 경로로 빈 홀더 검사를 대신하지 않습니다.</w:t>
+        <w:t>카트리지를 분리한 빈 홀더에서 Q2299A 접점 → 리본 → 변환보드 패드까지 16개 접점의 도통을 확인하고 방향 사진을 남겨 주시기 바랍니다. 의도된 공통 연결과 인접 단락을 구분하여 확인 부탁드립니다.</w:t>
       </w:r>
     </w:p>
     <w:p>
@@ -7231,7 +7352,7 @@
           <w:color w:val="000000"/>
           <w:sz w:val="21"/>
         </w:rPr>
-        <w:t>FFC 기준은 16핀 1.0mm입니다. 실제 소켓의 접점 면·허용 리본 두께·접점 전류·전압 정격과 삽입 잠금을 대조해 주세요. 사급 범용 보드가 부적합하면 적합한 변환부와 연결법을 제안하고 승인을 받은 뒤 진행합니다. 두 공통 전원 접점에 전류가 균등 분담된다고 가정하지 않습니다.</w:t>
+        <w:t>FFC 기준은 16핀 1.0mm입니다. 실제 소켓의 접점 면·허용 리본 두께·접점 전류·전압 정격과 삽입 잠금을 대조 부탁드립니다. 제공한 변환보드가 적합하지 않은 경우 호환되는 변환부와 연결 방식을 제안해 주시면 감사하겠습니다. 공통 전원 접점의 전류 분담도 확인 항목에 포함해 주시기 바랍니다.</w:t>
       </w:r>
     </w:p>
     <w:p>
@@ -7242,7 +7363,7 @@
           <w:color w:val="000000"/>
           <w:sz w:val="21"/>
         </w:rPr>
-        <w:t>실물 패드 번호와 노즐의 물리적 배열 순서는 아직 확인하지 않았습니다. RC 참조표만으로 실제 헤드를 통전하지 않습니다. 현물 접점표가 작성된 후 헤드 하네스 최종 결선을 승인하려고 합니다.</w:t>
+        <w:t>실제 변환보드 패드 번호와 노즐 배열은 현물 대조가 필요한 항목입니다. 확인된 접점표를 기준으로 헤드 배선 최종 연결과 검사를 부탁드립니다.</w:t>
       </w:r>
     </w:p>
     <w:p>
@@ -7255,7 +7376,7 @@
         <w:pStyle w:val="Heading1"/>
       </w:pPr>
       <w:r>
-        <w:t>8 케이블과 완성 조립품 납품</w:t>
+        <w:t>9 케이블 최종 연결과 납품</w:t>
       </w:r>
     </w:p>
     <w:tbl>
@@ -7931,7 +8052,7 @@
           <w:color w:val="000000"/>
           <w:sz w:val="21"/>
         </w:rPr>
-        <w:t>견적용 길이는 가동 헤드선 약 1m, 센서선 각각 0.9m 이내, 드라이버 전원 분기선 각각 0.5m 이내입니다. 최종 재단 길이는 기계 배치와 양끝 커넥터를 확인한 뒤 정해 주세요. 움직이는 헤드선은 유연한 22AWG 실리콘선, 고정 전원선은 18AWG를 기준으로 검토합니다. 실제 단자 정격·전압강하·굴곡과 파형에 맞춰 확정합니다.</w:t>
+        <w:t>견적용 길이는 가동 헤드선 약 1m, 센서선 각각 0.9m 이내, 드라이버 전원 분기선 각각 0.5m 이내입니다. 예상 배치도와 가동 범위를 참고하여 최종 길이와 여유분 검토를 부탁드립니다. 움직이는 헤드선은 유연한 22AWG 실리콘선, 고정 전원선은 18AWG를 기준으로 실제 단자 정격·전압강하·굴곡과 파형에 맞게 검토 부탁드립니다.</w:t>
       </w:r>
     </w:p>
     <w:p>
@@ -7942,7 +8063,7 @@
           <w:color w:val="000000"/>
           <w:sz w:val="21"/>
         </w:rPr>
-        <w:t>케이블의 양끝은 커넥터 또는 해당 단자에 맞는 처리된 끝단으로 받습니다. 잠금·당김 방지·절연·번호 라벨을 포함하고, 제가 전선을 가공해야 연결되는 상태는 피하고 싶습니다. 커넥터 모델·핀 순서·굵기·최종 길이는 업체에서 선정해 승인받아 주세요.</w:t>
+        <w:t>케이블은 양끝 결선과 나사단자 체결, 절연·잠금·당김 방지를 모두 완료하여 부탁드립니다. 분리 구간은 번호별 플러그 연결만으로 사용할 수 있는 형태로 요청드립니다. 가공된 전선 끝을 별도로 체결해야 하는 상태는 납품 범위에 포함하지 않으며, 커넥터 모델·핀 순서·선 굵기·최종 길이는 제작 도면과 납품 자료에 기록 부탁드립니다.</w:t>
       </w:r>
     </w:p>
     <w:p>
@@ -7953,7 +8074,7 @@
           <w:color w:val="000000"/>
           <w:sz w:val="21"/>
         </w:rPr>
-        <w:t>납품 형태는 결선된 제어함 1식, 고정 가능한 헤드 연결부 1식, 표시된 외부 케이블과 접점 스위치 3개입니다. 제어함의 보드 고정·케이블 구멍·통풍·노출 단자 보호를 완료해 주세요. 기존 후보는 화신 EG-AGH304016이지만 내부 배치가 아직 확정되지 않아 업체 권장 규격을 검토할 수 있습니다.</w:t>
+        <w:t>납품 범위는 결선된 제어함과 모터·헤드·접점 스위치·전원 연결부를 포함한 전기부 전체입니다. 제어함의 보드 고정·케이블 구멍·통풍·노출 단자 보호와 연결부 고정을 완료하여 부탁드립니다. 제어함은 화신 EG-AGH304016을 참고 규격으로 검토하고 있으며, 내부 배치에 적합한 규격이 있는 경우 제안 부탁드립니다.</w:t>
       </w:r>
     </w:p>
     <w:p>
@@ -7964,7 +8085,7 @@
           <w:color w:val="000000"/>
           <w:sz w:val="21"/>
         </w:rPr>
-        <w:t>함 밖에는 외장 어댑터와 모터·헤드·스위치 연결만 남기고, 24V와 18V 수동 스위치를 사용하기 쉬운 위치에 표시해 주세요. 열이 나는 드라이버·저항의 간격과 통풍을 확보합니다. 기판 조립, 배선, 검사 담당을 업체 내부에서 통합해 주세요.</w:t>
+        <w:t>24V와 18V 수동 스위치는 용도를 표시하여 사용하기 쉬운 위치에 배치 부탁드립니다. 열이 나는 드라이버·저항의 간격과 통풍, 케이블 연결부의 당김 방지를 확보해 주시기 바랍니다. 분리 구간은 양쪽에 같은 번호와 연결 방향을 표시하고 플러그 사진을 포함한 안내를 요청드립니다.</w:t>
       </w:r>
     </w:p>
     <w:p>
@@ -7975,7 +8096,7 @@
           <w:color w:val="000000"/>
           <w:sz w:val="21"/>
         </w:rPr>
-        <w:t>함께 받고 싶은 자료는 최종 회로도와 핀별 연결표, 커넥터 사진·번호 안내, 실제 소부품 명세, 설정값, 검사 결과와 측정 사진입니다. 제가 읽을 연결 안내는 고정 위치 → 전원 코드 → 번호별 케이블 → 첫 전원 순서로 간단히 부탁드립니다.</w:t>
+        <w:t>최종 회로도와 핀별 연결표, 커넥터 사진, 실제 소부품 명세, 설정값, 검사 결과와 측정 사진을 함께 전달 부탁드립니다. 전원 투입·종료 순서와 기본 점검 방법도 간단한 사용 안내로 포함해 주시면 감사하겠습니다.</w:t>
       </w:r>
     </w:p>
     <w:p>
@@ -7988,7 +8109,7 @@
         <w:pStyle w:val="Heading1"/>
       </w:pPr>
       <w:r>
-        <w:t>9 검사 범위와 견적 회신</w:t>
+        <w:t>10 검사 범위와 견적 회신</w:t>
       </w:r>
     </w:p>
     <w:tbl>
@@ -8250,7 +8371,7 @@
                 <w:color w:val="000000"/>
                 <w:sz w:val="18"/>
               </w:rPr>
-              <w:t>3 모터 시험</w:t>
+              <w:t>3 모터와 스위치 벤치 시험</w:t>
             </w:r>
           </w:p>
         </w:tc>
@@ -8271,7 +8392,7 @@
                 <w:color w:val="000000"/>
                 <w:sz w:val="18"/>
               </w:rPr>
-              <w:t>실제 DM332T 부하의 신호와 헤드 OFF 저속 왕복, 원점·끝단·정지 입력</w:t>
+              <w:t>프레임 장착 전 모터별 저속 정역회전, 스위치 누름·해제·단선 입력, 정지 요청 처리</w:t>
             </w:r>
           </w:p>
         </w:tc>
@@ -8548,7 +8669,7 @@
           <w:color w:val="000000"/>
           <w:sz w:val="21"/>
         </w:rPr>
-        <w:t>신호 상실·출력 고착 때 분사를 차단하고, 정지 요청 때 이동과 분사를 멈추는 방법도 검토해 주세요. 추가 보호 회로 또는 코드가 필요하면 기능·부품·금액을 구분해 제안해 주세요. 현재 ARM은 모터 전원 차단이 아니며 전시 무인 운영 보호가 완성된 상태는 아닙니다.</w:t>
+        <w:t>신호 상실·출력 고착 때 분사를 차단하고, 정지 요청 때 이동과 분사를 멈추는 방식도 검토 부탁드립니다. 추가 보호 회로 또는 코드가 필요한 경우 기능·부품·비용을 구분하여 제안해 주시기 바랍니다. ARM은 펄스 전달 차단이므로 전원 차단과 구분하여 검토 부탁드립니다.</w:t>
       </w:r>
     </w:p>
     <w:p>
@@ -8559,7 +8680,7 @@
           <w:color w:val="000000"/>
           <w:sz w:val="21"/>
         </w:rPr>
-        <w:t>검사용 신호 발생기 또는 간단한 시험 코드는 업체 준비 가능 여부와 비용을 알려 주세요. 메인 전시 프로그램과 전체 인쇄 펌웨어는 제가 이후 진행하므로, 별도 신호 준비가 필요한 항목은 견적 단계에서 합의하고 싶습니다. 도통·외관 검사만 가능한 경우 기능검사 가능 범위를 구분해 주세요.</w:t>
+        <w:t>검사용 신호·코드 준비, 시험 실행, 오실로스코프 계측과 전기적 고장 진단까지 일괄 수행 가능한지 안내 부탁드립니다. 검사 불합격 항목의 원인 확인·보완·재검사도 포함하여 요청드립니다. 납품 후 별도의 전기 계측이나 고장 진단 없이 번호별 플러그 연결과 전원 사용이 가능한 범위인지, 미포함 항목이 있다면 회신에 명시해 주시면 감사하겠습니다.</w:t>
       </w:r>
     </w:p>
     <w:p>
@@ -8570,7 +8691,18 @@
           <w:color w:val="000000"/>
           <w:sz w:val="21"/>
         </w:rPr>
-        <w:t>회신에는 1대분 통합 제작 가능 여부, 사급 수락과 필요한 현물, 도면 보완·소부품·조립·케이블·제어함·시험 코드·검사별 금액과 VAT, 부품 입고 마감일·작업일·반송일, 납품 자료, 초기불량·시험손상 처리 조건을 부탁드립니다. 추가 금액이나 모델 변경은 작업 전에 승인받아 주세요.</w:t>
+        <w:t>모터·스위치 검사는 벤치 전기 시험을 기준으로 합니다. 실제 이동거리와 원점·끝단 위치, 급지 정렬과 연속 인쇄 시험은 기계 조립 후 실시하는 별도 항목이며 이번 견적의 프레임 조립·운동 시험 범위로 포함하지 않습니다.</w:t>
+      </w:r>
+    </w:p>
+    <w:p>
+      <w:r>
+        <w:rPr>
+          <w:rFonts w:ascii="Arial" w:hAnsi="Arial" w:eastAsia="Apple SD Gothic Neo"/>
+          <w:b w:val="0"/>
+          <w:color w:val="000000"/>
+          <w:sz w:val="21"/>
+        </w:rPr>
+        <w:t>1대분 제작 가능 여부와 필요한 현물, 도면 보완·소부품·조립·케이블 최종 연결·제어함·시험 코드·검사별 금액 및 VAT를 안내 부탁드립니다. 부품 입고 마감일, 작업 기간과 납품 일정, 제공 가능한 납품 자료, 초기불량과 시험 중 손상에 대한 처리 조건도 함께 회신해 주시면 감사하겠습니다. 추가 비용이나 부품 변경이 필요한 경우 작업 전 협의를 부탁드립니다.</w:t>
       </w:r>
     </w:p>
     <w:p>
@@ -8583,7 +8715,7 @@
         <w:pStyle w:val="Heading1"/>
       </w:pPr>
       <w:r>
-        <w:t>10 참고 회로와 제작 검토 자료</w:t>
+        <w:t>11 참고 회로와 제작 검토 자료</w:t>
       </w:r>
     </w:p>
     <w:p>
@@ -8594,7 +8726,7 @@
           <w:color w:val="000000"/>
           <w:sz w:val="19"/>
         </w:rPr>
-        <w:t>이 파일의 연결표는 기존 설계 기준을 통합한 것입니다. 상세 이력은 저장소 printer 폴더의 I4 WIRING, MOTOR POWER, HEAD TEST, HEAD CONTACT, G4 INPUTS 문서에 있습니다. 최초 검토에 여러 파일을 따로 열 필요가 없도록 연결 기준을 이 파일에 실었습니다.</w:t>
+        <w:t>회로 검토에 참고하실 제조사 자료와 헤드 구동 사례를 아래에 정리하였습니다.</w:t>
       </w:r>
     </w:p>
     <w:p>
@@ -8607,7 +8739,7 @@
         </w:rPr>
         <w:t xml:space="preserve">원작 헤드 Figure 9와 실험값: </w:t>
       </w:r>
-      <w:hyperlink r:id="rId12">
+      <w:hyperlink r:id="rId13">
         <w:r>
           <w:rPr>
             <w:rFonts w:ascii="Arial"/>
@@ -8628,7 +8760,7 @@
         </w:rPr>
         <w:t xml:space="preserve">분사 보드 제조사 회로도: </w:t>
       </w:r>
-      <w:hyperlink r:id="rId13">
+      <w:hyperlink r:id="rId14">
         <w:r>
           <w:rPr>
             <w:rFonts w:ascii="Arial"/>
@@ -8649,7 +8781,7 @@
         </w:rPr>
         <w:t xml:space="preserve">분사 보드 제품: </w:t>
       </w:r>
-      <w:hyperlink r:id="rId14">
+      <w:hyperlink r:id="rId15">
         <w:r>
           <w:rPr>
             <w:rFonts w:ascii="Arial"/>
@@ -8670,7 +8802,7 @@
         </w:rPr>
         <w:t xml:space="preserve">DM332T 설명서: </w:t>
       </w:r>
-      <w:hyperlink r:id="rId15">
+      <w:hyperlink r:id="rId16">
         <w:r>
           <w:rPr>
             <w:rFonts w:ascii="Arial"/>
@@ -8691,7 +8823,7 @@
         </w:rPr>
         <w:t xml:space="preserve">SN74ACT244 자료: </w:t>
       </w:r>
-      <w:hyperlink r:id="rId16">
+      <w:hyperlink r:id="rId17">
         <w:r>
           <w:rPr>
             <w:rFonts w:ascii="Arial"/>
@@ -8712,7 +8844,7 @@
         </w:rPr>
         <w:t xml:space="preserve">SN74AHCT14 자료: </w:t>
       </w:r>
-      <w:hyperlink r:id="rId17">
+      <w:hyperlink r:id="rId18">
         <w:r>
           <w:rPr>
             <w:rFonts w:ascii="Arial"/>
@@ -8733,7 +8865,7 @@
         </w:rPr>
         <w:t xml:space="preserve">프로젝트 저장소: </w:t>
       </w:r>
-      <w:hyperlink r:id="rId18">
+      <w:hyperlink r:id="rId19">
         <w:r>
           <w:rPr>
             <w:rFonts w:ascii="Arial"/>
@@ -8752,7 +8884,7 @@
           <w:color w:val="000000"/>
           <w:sz w:val="19"/>
         </w:rPr>
-        <w:t>실물 검사 전 비어 있는 부분은 FFC 패드 번호, X축 모터 전류 설정, 최종 케이블 커넥터·길이와 제어함 배치입니다. 이 부분의 확인과 제작용 도면 정리를 함께 요청합니다. 수락 범위와 견적을 받은 뒤 부품 전달 및 제작 승인을 진행하려고 합니다.</w:t>
+        <w:t>FFC 패드 번호, X축 모터 전류 설정, 최종 커넥터·케이블 길이와 제어함 배치는 현물 확인이 필요한 항목입니다. 제작용 도면 보완과 함께 검토 부탁드립니다.</w:t>
       </w:r>
     </w:p>
     <w:sectPr>

</xml_diff>